<commit_message>
Renumber manuscript tables as Table 1 and Table 2
The draft had no Table 1: the two tables are now Table 1 and Table 2 in
the text, captions, PDF, table files and summary script.

Co-Authored-By: Claude Opus 5.5 <noreply@anthropic.com>
Claude-Session: https://claude.ai/code/session_01U9Cn7iCew7ppRK57CuyZyz
</commit_message>
<xml_diff>
--- a/article/DoAggregate_bioRxiv_draft.docx
+++ b/article/DoAggregate_bioRxiv_draft.docx
@@ -3966,7 +3966,7 @@
           <w:sz w:val="24"/>
           <w:lang w:val="en-US"/>
         </w:rPr>
-        <w:t>After filtering, the dataset contained 81,242 unique rare variants (63,761 in cases and 60,184 in controls), corresponding to 210,949 and 196,058 variant calls in cases and controls, respectively. These variants fell in 12,969 genes, of which 10,447 (80.6%) carried at least two unique variants and were tested; the remaining 2,522 genes, each with a single variant, were reported as not analyzed. The over-representation analysis on the genes carrying at least one rare variant in the cohort retained 85 non-redundant significant terms (48 DisGeNET, 18 GO-BP, 9 GO-MF, 9 GO-CC, 1 WikiPathways), which defined 49 pathway regions and 36 GO-term regions for aggregation testing (Table 2, Figure 2a).</w:t>
+        <w:t>After filtering, the dataset contained 81,242 unique rare variants (63,761 in cases and 60,184 in controls), corresponding to 210,949 and 196,058 variant calls in cases and controls, respectively. These variants fell in 12,969 genes, of which 10,447 (80.6%) carried at least two unique variants and were tested; the remaining 2,522 genes, each with a single variant, were reported as not analyzed. The over-representation analysis on the genes carrying at least one rare variant in the cohort retained 85 non-redundant significant terms (48 DisGeNET, 18 GO-BP, 9 GO-MF, 9 GO-CC, 1 WikiPathways), which defined 49 pathway regions and 36 GO-term regions for aggregation testing (Table 1, Figure 2a).</w:t>
       </w:r>
     </w:p>
     <w:p>
@@ -3985,7 +3985,7 @@
           <w:sz w:val="24"/>
           <w:lang w:val="en-US"/>
         </w:rPr>
-        <w:t>At the gene level, 5 of 10,447 tested genes (0.05%) reached an Excalibur q-value of at most 0.05 (median q-value 1; Table 3, Figure 2b), consistent with the near-null design. For AKR1E2, ADK and GANC, the total number of variants was higher in cases than in controls, so DoAggregate exported their variant-level data for direct inspection; for GNB2 and GIGYF1, the signal was driven by an excess of variants in controls (Figure 2c). A median of 30 of the 36 Excalibur tests could be applied per gene (range 18–30), the others failing or not being applicable to the region. At the GO-term level, 2 of 36 regions were significant (endoplasmic reticulum tubular network, q = 0.033; low-density lipoprotein particle binding, q = 0.033), and no over-represented pathway reached significance (lowest q = 0.32).</w:t>
+        <w:t>At the gene level, 5 of 10,447 tested genes (0.05%) reached an Excalibur q-value of at most 0.05 (median q-value 1; Table 2, Figure 2b), consistent with the near-null design. For AKR1E2, ADK and GANC, the total number of variants was higher in cases than in controls, so DoAggregate exported their variant-level data for direct inspection; for GNB2 and GIGYF1, the signal was driven by an excess of variants in controls (Figure 2c). A median of 30 of the 36 Excalibur tests could be applied per gene (range 18–30), the others failing or not being applicable to the region. At the GO-term level, 2 of 36 regions were significant (endoplasmic reticulum tubular network, q = 0.033; low-density lipoprotein particle binding, q = 0.033), and no over-represented pathway reached significance (lowest q = 0.32).</w:t>
       </w:r>
     </w:p>
     <w:p>
@@ -4072,7 +4072,7 @@
           <w:sz w:val="24"/>
           <w:lang w:val="en-US"/>
         </w:rPr>
-        <w:t xml:space="preserve">Table 2. </w:t>
+        <w:t xml:space="preserve">Table 1. </w:t>
       </w:r>
       <w:r>
         <w:rPr>
@@ -4655,7 +4655,7 @@
           <w:sz w:val="24"/>
           <w:lang w:val="en-US"/>
         </w:rPr>
-        <w:t xml:space="preserve">Table 3. </w:t>
+        <w:t xml:space="preserve">Table 2. </w:t>
       </w:r>
       <w:r>
         <w:rPr>

</xml_diff>